<commit_message>
Script-only openers: LifeGroup Sunday + stay-connected QR
Keep these off the website; they lead the spoken read-through only.
</commit_message>
<xml_diff>
--- a/scripts/Announcement-Script-2026-07-26.docx
+++ b/scripts/Announcement-Script-2026-07-26.docx
@@ -15,6 +15,94 @@
           <w:sz w:val="22"/>
         </w:rPr>
         <w:t>Sunday, July 26th Announcements — Prayer Service</w:t>
+      </w:r>
+    </w:p>
+    <w:p>
+      <w:pPr>
+        <w:spacing w:before="200" w:after="200" w:line="240" w:lineRule="auto"/>
+        <w:pBdr>
+          <w:bottom w:val="single" w:sz="6" w:space="8" w:color="BFBFBF"/>
+        </w:pBdr>
+      </w:pPr>
+      <w:r>
+        <w:rPr>
+          <w:rFonts w:ascii="Arial" w:hAnsi="Arial" w:eastAsia="Arial"/>
+          <w:b/>
+          <w:color w:val="C00000"/>
+          <w:sz w:val="22"/>
+        </w:rPr>
+        <w:t>As today is our LifeGroup Sunday</w:t>
+      </w:r>
+      <w:r>
+        <w:rPr>
+          <w:rFonts w:ascii="Arial" w:hAnsi="Arial" w:eastAsia="Arial"/>
+          <w:b w:val="0"/>
+          <w:color w:val="000000"/>
+          <w:sz w:val="22"/>
+        </w:rPr>
+        <w:t xml:space="preserve">, the list and locations of the LifeGroups will be displayed on the screen. Please take note — if you are not in any LifeGroup yet, </w:t>
+      </w:r>
+      <w:r>
+        <w:rPr>
+          <w:rFonts w:ascii="Arial" w:hAnsi="Arial" w:eastAsia="Arial"/>
+          <w:b/>
+          <w:color w:val="C00000"/>
+          <w:sz w:val="22"/>
+        </w:rPr>
+        <w:t>join one today!</w:t>
+      </w:r>
+    </w:p>
+    <w:p>
+      <w:pPr>
+        <w:spacing w:before="200" w:after="200" w:line="240" w:lineRule="auto"/>
+        <w:pBdr>
+          <w:bottom w:val="single" w:sz="6" w:space="8" w:color="BFBFBF"/>
+        </w:pBdr>
+      </w:pPr>
+      <w:r>
+        <w:rPr>
+          <w:rFonts w:ascii="Arial" w:hAnsi="Arial" w:eastAsia="Arial"/>
+          <w:b/>
+          <w:color w:val="C00000"/>
+          <w:sz w:val="22"/>
+        </w:rPr>
+        <w:t>Stay connected with LifePointe.</w:t>
+      </w:r>
+      <w:r>
+        <w:rPr>
+          <w:rFonts w:ascii="Arial" w:hAnsi="Arial" w:eastAsia="Arial"/>
+          <w:b w:val="0"/>
+          <w:color w:val="000000"/>
+          <w:sz w:val="22"/>
+        </w:rPr>
+        <w:t xml:space="preserve"> For all announcements, links and forms, </w:t>
+      </w:r>
+      <w:r>
+        <w:rPr>
+          <w:rFonts w:ascii="Arial" w:hAnsi="Arial" w:eastAsia="Arial"/>
+          <w:b/>
+          <w:color w:val="C00000"/>
+          <w:sz w:val="22"/>
+        </w:rPr>
+        <w:t>scan the QR code</w:t>
+      </w:r>
+      <w:r>
+        <w:rPr>
+          <w:rFonts w:ascii="Arial" w:hAnsi="Arial" w:eastAsia="Arial"/>
+          <w:b w:val="0"/>
+          <w:color w:val="000000"/>
+          <w:sz w:val="22"/>
+        </w:rPr>
+        <w:t xml:space="preserve"> on the screen or visit </w:t>
+      </w:r>
+      <w:r>
+        <w:rPr>
+          <w:rFonts w:ascii="Arial" w:hAnsi="Arial" w:eastAsia="Arial"/>
+          <w:b/>
+          <w:color w:val="C00000"/>
+          <w:sz w:val="22"/>
+        </w:rPr>
+        <w:t>lifepointeng.org/gl/updates/</w:t>
       </w:r>
     </w:p>
     <w:p>

</xml_diff>

<commit_message>
Make script dividers visible in Google Docs
Use a grey line paragraph between items so rules survive Drive import.
</commit_message>
<xml_diff>
--- a/scripts/Announcement-Script-2026-07-26.docx
+++ b/scripts/Announcement-Script-2026-07-26.docx
@@ -19,10 +19,7 @@
     </w:p>
     <w:p>
       <w:pPr>
-        <w:spacing w:before="200" w:after="200" w:line="240" w:lineRule="auto"/>
-        <w:pBdr>
-          <w:bottom w:val="single" w:sz="6" w:space="8" w:color="BFBFBF"/>
-        </w:pBdr>
+        <w:spacing w:before="200" w:after="120" w:line="240" w:lineRule="auto"/>
       </w:pPr>
       <w:r>
         <w:rPr>
@@ -54,10 +51,20 @@
     </w:p>
     <w:p>
       <w:pPr>
-        <w:spacing w:before="200" w:after="200" w:line="240" w:lineRule="auto"/>
-        <w:pBdr>
-          <w:bottom w:val="single" w:sz="6" w:space="8" w:color="BFBFBF"/>
-        </w:pBdr>
+        <w:spacing w:before="40" w:after="40"/>
+      </w:pPr>
+      <w:r>
+        <w:rPr>
+          <w:rFonts w:ascii="Arial" w:hAnsi="Arial" w:eastAsia="Arial"/>
+          <w:color w:val="BFBFBF"/>
+          <w:sz w:val="16"/>
+        </w:rPr>
+        <w:t>────────────────────────────────────────────────────────────────────────</w:t>
+      </w:r>
+    </w:p>
+    <w:p>
+      <w:pPr>
+        <w:spacing w:before="200" w:after="120" w:line="240" w:lineRule="auto"/>
       </w:pPr>
       <w:r>
         <w:rPr>
@@ -107,10 +114,20 @@
     </w:p>
     <w:p>
       <w:pPr>
-        <w:spacing w:before="200" w:after="200" w:line="240" w:lineRule="auto"/>
-        <w:pBdr>
-          <w:bottom w:val="single" w:sz="6" w:space="8" w:color="BFBFBF"/>
-        </w:pBdr>
+        <w:spacing w:before="40" w:after="40"/>
+      </w:pPr>
+      <w:r>
+        <w:rPr>
+          <w:rFonts w:ascii="Arial" w:hAnsi="Arial" w:eastAsia="Arial"/>
+          <w:color w:val="BFBFBF"/>
+          <w:sz w:val="16"/>
+        </w:rPr>
+        <w:t>────────────────────────────────────────────────────────────────────────</w:t>
+      </w:r>
+    </w:p>
+    <w:p>
+      <w:pPr>
+        <w:spacing w:before="200" w:after="120" w:line="240" w:lineRule="auto"/>
       </w:pPr>
       <w:r>
         <w:rPr>
@@ -160,10 +177,20 @@
     </w:p>
     <w:p>
       <w:pPr>
-        <w:spacing w:before="200" w:after="200" w:line="240" w:lineRule="auto"/>
-        <w:pBdr>
-          <w:bottom w:val="single" w:sz="6" w:space="8" w:color="BFBFBF"/>
-        </w:pBdr>
+        <w:spacing w:before="40" w:after="40"/>
+      </w:pPr>
+      <w:r>
+        <w:rPr>
+          <w:rFonts w:ascii="Arial" w:hAnsi="Arial" w:eastAsia="Arial"/>
+          <w:color w:val="BFBFBF"/>
+          <w:sz w:val="16"/>
+        </w:rPr>
+        <w:t>────────────────────────────────────────────────────────────────────────</w:t>
+      </w:r>
+    </w:p>
+    <w:p>
+      <w:pPr>
+        <w:spacing w:before="200" w:after="120" w:line="240" w:lineRule="auto"/>
       </w:pPr>
       <w:r>
         <w:rPr>
@@ -240,10 +267,20 @@
     </w:p>
     <w:p>
       <w:pPr>
-        <w:spacing w:before="200" w:after="200" w:line="240" w:lineRule="auto"/>
-        <w:pBdr>
-          <w:bottom w:val="single" w:sz="6" w:space="8" w:color="BFBFBF"/>
-        </w:pBdr>
+        <w:spacing w:before="40" w:after="40"/>
+      </w:pPr>
+      <w:r>
+        <w:rPr>
+          <w:rFonts w:ascii="Arial" w:hAnsi="Arial" w:eastAsia="Arial"/>
+          <w:color w:val="BFBFBF"/>
+          <w:sz w:val="16"/>
+        </w:rPr>
+        <w:t>────────────────────────────────────────────────────────────────────────</w:t>
+      </w:r>
+    </w:p>
+    <w:p>
+      <w:pPr>
+        <w:spacing w:before="200" w:after="120" w:line="240" w:lineRule="auto"/>
       </w:pPr>
       <w:r>
         <w:rPr>
@@ -284,10 +321,20 @@
     </w:p>
     <w:p>
       <w:pPr>
-        <w:spacing w:before="200" w:after="200" w:line="240" w:lineRule="auto"/>
-        <w:pBdr>
-          <w:bottom w:val="single" w:sz="6" w:space="8" w:color="BFBFBF"/>
-        </w:pBdr>
+        <w:spacing w:before="40" w:after="40"/>
+      </w:pPr>
+      <w:r>
+        <w:rPr>
+          <w:rFonts w:ascii="Arial" w:hAnsi="Arial" w:eastAsia="Arial"/>
+          <w:color w:val="BFBFBF"/>
+          <w:sz w:val="16"/>
+        </w:rPr>
+        <w:t>────────────────────────────────────────────────────────────────────────</w:t>
+      </w:r>
+    </w:p>
+    <w:p>
+      <w:pPr>
+        <w:spacing w:before="200" w:after="120" w:line="240" w:lineRule="auto"/>
       </w:pPr>
       <w:r>
         <w:rPr>
@@ -391,10 +438,20 @@
     </w:p>
     <w:p>
       <w:pPr>
-        <w:spacing w:before="200" w:after="200" w:line="240" w:lineRule="auto"/>
-        <w:pBdr>
-          <w:bottom w:val="single" w:sz="6" w:space="8" w:color="BFBFBF"/>
-        </w:pBdr>
+        <w:spacing w:before="40" w:after="40"/>
+      </w:pPr>
+      <w:r>
+        <w:rPr>
+          <w:rFonts w:ascii="Arial" w:hAnsi="Arial" w:eastAsia="Arial"/>
+          <w:color w:val="BFBFBF"/>
+          <w:sz w:val="16"/>
+        </w:rPr>
+        <w:t>────────────────────────────────────────────────────────────────────────</w:t>
+      </w:r>
+    </w:p>
+    <w:p>
+      <w:pPr>
+        <w:spacing w:before="200" w:after="120" w:line="240" w:lineRule="auto"/>
       </w:pPr>
       <w:r>
         <w:rPr>
@@ -417,10 +474,20 @@
     </w:p>
     <w:p>
       <w:pPr>
-        <w:spacing w:before="200" w:after="200" w:line="240" w:lineRule="auto"/>
-        <w:pBdr>
-          <w:bottom w:val="single" w:sz="6" w:space="8" w:color="BFBFBF"/>
-        </w:pBdr>
+        <w:spacing w:before="40" w:after="40"/>
+      </w:pPr>
+      <w:r>
+        <w:rPr>
+          <w:rFonts w:ascii="Arial" w:hAnsi="Arial" w:eastAsia="Arial"/>
+          <w:color w:val="BFBFBF"/>
+          <w:sz w:val="16"/>
+        </w:rPr>
+        <w:t>────────────────────────────────────────────────────────────────────────</w:t>
+      </w:r>
+    </w:p>
+    <w:p>
+      <w:pPr>
+        <w:spacing w:before="200" w:after="120" w:line="240" w:lineRule="auto"/>
       </w:pPr>
       <w:r>
         <w:rPr>
@@ -452,10 +519,20 @@
     </w:p>
     <w:p>
       <w:pPr>
-        <w:spacing w:before="200" w:after="200" w:line="240" w:lineRule="auto"/>
-        <w:pBdr>
-          <w:bottom w:val="single" w:sz="6" w:space="8" w:color="BFBFBF"/>
-        </w:pBdr>
+        <w:spacing w:before="40" w:after="40"/>
+      </w:pPr>
+      <w:r>
+        <w:rPr>
+          <w:rFonts w:ascii="Arial" w:hAnsi="Arial" w:eastAsia="Arial"/>
+          <w:color w:val="BFBFBF"/>
+          <w:sz w:val="16"/>
+        </w:rPr>
+        <w:t>────────────────────────────────────────────────────────────────────────</w:t>
+      </w:r>
+    </w:p>
+    <w:p>
+      <w:pPr>
+        <w:spacing w:before="200" w:after="120" w:line="240" w:lineRule="auto"/>
       </w:pPr>
       <w:r>
         <w:rPr>
@@ -532,10 +609,20 @@
     </w:p>
     <w:p>
       <w:pPr>
-        <w:spacing w:before="200" w:after="200" w:line="240" w:lineRule="auto"/>
-        <w:pBdr>
-          <w:bottom w:val="single" w:sz="6" w:space="8" w:color="BFBFBF"/>
-        </w:pBdr>
+        <w:spacing w:before="40" w:after="40"/>
+      </w:pPr>
+      <w:r>
+        <w:rPr>
+          <w:rFonts w:ascii="Arial" w:hAnsi="Arial" w:eastAsia="Arial"/>
+          <w:color w:val="BFBFBF"/>
+          <w:sz w:val="16"/>
+        </w:rPr>
+        <w:t>────────────────────────────────────────────────────────────────────────</w:t>
+      </w:r>
+    </w:p>
+    <w:p>
+      <w:pPr>
+        <w:spacing w:before="200" w:after="120" w:line="240" w:lineRule="auto"/>
       </w:pPr>
       <w:r>
         <w:rPr>
@@ -594,10 +681,20 @@
     </w:p>
     <w:p>
       <w:pPr>
-        <w:spacing w:before="200" w:after="200" w:line="240" w:lineRule="auto"/>
-        <w:pBdr>
-          <w:bottom w:val="single" w:sz="6" w:space="8" w:color="BFBFBF"/>
-        </w:pBdr>
+        <w:spacing w:before="40" w:after="40"/>
+      </w:pPr>
+      <w:r>
+        <w:rPr>
+          <w:rFonts w:ascii="Arial" w:hAnsi="Arial" w:eastAsia="Arial"/>
+          <w:color w:val="BFBFBF"/>
+          <w:sz w:val="16"/>
+        </w:rPr>
+        <w:t>────────────────────────────────────────────────────────────────────────</w:t>
+      </w:r>
+    </w:p>
+    <w:p>
+      <w:pPr>
+        <w:spacing w:before="200" w:after="120" w:line="240" w:lineRule="auto"/>
       </w:pPr>
       <w:r>
         <w:rPr>
@@ -656,10 +753,20 @@
     </w:p>
     <w:p>
       <w:pPr>
-        <w:spacing w:before="200" w:after="200" w:line="240" w:lineRule="auto"/>
-        <w:pBdr>
-          <w:bottom w:val="single" w:sz="6" w:space="8" w:color="BFBFBF"/>
-        </w:pBdr>
+        <w:spacing w:before="40" w:after="40"/>
+      </w:pPr>
+      <w:r>
+        <w:rPr>
+          <w:rFonts w:ascii="Arial" w:hAnsi="Arial" w:eastAsia="Arial"/>
+          <w:color w:val="BFBFBF"/>
+          <w:sz w:val="16"/>
+        </w:rPr>
+        <w:t>────────────────────────────────────────────────────────────────────────</w:t>
+      </w:r>
+    </w:p>
+    <w:p>
+      <w:pPr>
+        <w:spacing w:before="200" w:after="120" w:line="240" w:lineRule="auto"/>
       </w:pPr>
       <w:r>
         <w:rPr>
@@ -700,10 +807,20 @@
     </w:p>
     <w:p>
       <w:pPr>
-        <w:spacing w:before="200" w:after="200" w:line="240" w:lineRule="auto"/>
-        <w:pBdr>
-          <w:bottom w:val="single" w:sz="6" w:space="8" w:color="BFBFBF"/>
-        </w:pBdr>
+        <w:spacing w:before="40" w:after="40"/>
+      </w:pPr>
+      <w:r>
+        <w:rPr>
+          <w:rFonts w:ascii="Arial" w:hAnsi="Arial" w:eastAsia="Arial"/>
+          <w:color w:val="BFBFBF"/>
+          <w:sz w:val="16"/>
+        </w:rPr>
+        <w:t>────────────────────────────────────────────────────────────────────────</w:t>
+      </w:r>
+    </w:p>
+    <w:p>
+      <w:pPr>
+        <w:spacing w:before="200" w:after="120" w:line="240" w:lineRule="auto"/>
       </w:pPr>
       <w:r>
         <w:rPr>
@@ -744,10 +861,20 @@
     </w:p>
     <w:p>
       <w:pPr>
-        <w:spacing w:before="200" w:after="200" w:line="240" w:lineRule="auto"/>
-        <w:pBdr>
-          <w:bottom w:val="single" w:sz="6" w:space="8" w:color="BFBFBF"/>
-        </w:pBdr>
+        <w:spacing w:before="40" w:after="40"/>
+      </w:pPr>
+      <w:r>
+        <w:rPr>
+          <w:rFonts w:ascii="Arial" w:hAnsi="Arial" w:eastAsia="Arial"/>
+          <w:color w:val="BFBFBF"/>
+          <w:sz w:val="16"/>
+        </w:rPr>
+        <w:t>────────────────────────────────────────────────────────────────────────</w:t>
+      </w:r>
+    </w:p>
+    <w:p>
+      <w:pPr>
+        <w:spacing w:before="200" w:after="120" w:line="240" w:lineRule="auto"/>
       </w:pPr>
       <w:r>
         <w:rPr>
@@ -788,7 +915,20 @@
     </w:p>
     <w:p>
       <w:pPr>
-        <w:spacing w:before="200" w:after="200" w:line="240" w:lineRule="auto"/>
+        <w:spacing w:before="40" w:after="40"/>
+      </w:pPr>
+      <w:r>
+        <w:rPr>
+          <w:rFonts w:ascii="Arial" w:hAnsi="Arial" w:eastAsia="Arial"/>
+          <w:color w:val="BFBFBF"/>
+          <w:sz w:val="16"/>
+        </w:rPr>
+        <w:t>────────────────────────────────────────────────────────────────────────</w:t>
+      </w:r>
+    </w:p>
+    <w:p>
+      <w:pPr>
+        <w:spacing w:before="200" w:after="120" w:line="240" w:lineRule="auto"/>
       </w:pPr>
       <w:r>
         <w:rPr>

</xml_diff>

<commit_message>
Add Hangout 2026 to announcements and read-through script
Flyer, Luma register link, and script line for 5 & 12 September.
</commit_message>
<xml_diff>
--- a/scripts/Announcement-Script-2026-07-26.docx
+++ b/scripts/Announcement-Script-2026-07-26.docx
@@ -173,6 +173,78 @@
           <w:sz w:val="22"/>
         </w:rPr>
         <w:t>Don't miss it.</w:t>
+      </w:r>
+    </w:p>
+    <w:p>
+      <w:pPr>
+        <w:spacing w:before="40" w:after="40"/>
+      </w:pPr>
+      <w:r>
+        <w:rPr>
+          <w:rFonts w:ascii="Arial" w:hAnsi="Arial" w:eastAsia="Arial"/>
+          <w:color w:val="BFBFBF"/>
+          <w:sz w:val="16"/>
+        </w:rPr>
+        <w:t>────────────────────────────────────────────────────────────────────────</w:t>
+      </w:r>
+    </w:p>
+    <w:p>
+      <w:pPr>
+        <w:spacing w:before="200" w:after="120" w:line="240" w:lineRule="auto"/>
+      </w:pPr>
+      <w:r>
+        <w:rPr>
+          <w:rFonts w:ascii="Arial" w:hAnsi="Arial" w:eastAsia="Arial"/>
+          <w:b/>
+          <w:color w:val="C00000"/>
+          <w:sz w:val="22"/>
+        </w:rPr>
+        <w:t>Hangout 2026</w:t>
+      </w:r>
+      <w:r>
+        <w:rPr>
+          <w:rFonts w:ascii="Arial" w:hAnsi="Arial" w:eastAsia="Arial"/>
+          <w:b w:val="0"/>
+          <w:color w:val="000000"/>
+          <w:sz w:val="22"/>
+        </w:rPr>
+        <w:t xml:space="preserve"> is coming — </w:t>
+      </w:r>
+      <w:r>
+        <w:rPr>
+          <w:rFonts w:ascii="Arial" w:hAnsi="Arial" w:eastAsia="Arial"/>
+          <w:b/>
+          <w:color w:val="C00000"/>
+          <w:sz w:val="22"/>
+        </w:rPr>
+        <w:t>5th and 12th September 2026</w:t>
+      </w:r>
+      <w:r>
+        <w:rPr>
+          <w:rFonts w:ascii="Arial" w:hAnsi="Arial" w:eastAsia="Arial"/>
+          <w:b w:val="0"/>
+          <w:color w:val="000000"/>
+          <w:sz w:val="22"/>
+        </w:rPr>
+        <w:t xml:space="preserve">. Organised by Surge and LifePointe, it's strictly for singles: music, games, unplugged convos, networking and more, across Lagos, Abuja, Ibadan and Abeokuta. Register at </w:t>
+      </w:r>
+      <w:r>
+        <w:rPr>
+          <w:rFonts w:ascii="Arial" w:hAnsi="Arial" w:eastAsia="Arial"/>
+          <w:b/>
+          <w:color w:val="C00000"/>
+          <w:sz w:val="22"/>
+        </w:rPr>
+        <w:t>luma.com/5qjsfrg1</w:t>
+      </w:r>
+      <w:r>
+        <w:rPr>
+          <w:rFonts w:ascii="Arial" w:hAnsi="Arial" w:eastAsia="Arial"/>
+          <w:b w:val="0"/>
+          <w:color w:val="000000"/>
+          <w:sz w:val="22"/>
+        </w:rPr>
+        <w:t xml:space="preserve"> — and you definitely don't want to miss this.</w:t>
       </w:r>
     </w:p>
     <w:p>

</xml_diff>